<commit_message>
Initial commit: BLINSAFE Contratos - Contract automation tool
- Automated contract document generation
- PDF data extraction
- Bitrix integration for template management
- DOCX/PDF conversion support
- Support for multiple contract modalities

Co-Authored-By: Claude Haiku 4.5 <noreply@anthropic.com>
</commit_message>
<xml_diff>
--- a/templates/emprestimo.docx
+++ b/templates/emprestimo.docx
@@ -154,19 +154,7 @@
           <w:szCs w:val="20"/>
           <w:highlight w:val="white"/>
         </w:rPr>
-        <w:t>bloco_</w:t>
-      </w:r>
-      <w:proofErr w:type="gramStart"/>
-      <w:r>
-        <w:rPr>
-          <w:rFonts w:ascii="Arial" w:eastAsia="Arial" w:hAnsi="Arial" w:cs="Arial"/>
-          <w:bCs/>
-          <w:color w:val="000000" w:themeColor="text1"/>
-          <w:sz w:val="20"/>
-          <w:szCs w:val="20"/>
-          <w:highlight w:val="white"/>
-        </w:rPr>
-        <w:t>cliente</w:t>
+        <w:t>bloco_cliente</w:t>
       </w:r>
       <w:proofErr w:type="spellEnd"/>
       <w:r>
@@ -178,19 +166,7 @@
           <w:szCs w:val="20"/>
           <w:highlight w:val="white"/>
         </w:rPr>
-        <w:t xml:space="preserve"> }</w:t>
-      </w:r>
-      <w:proofErr w:type="gramEnd"/>
-      <w:r>
-        <w:rPr>
-          <w:rFonts w:ascii="Arial" w:eastAsia="Arial" w:hAnsi="Arial" w:cs="Arial"/>
-          <w:bCs/>
-          <w:color w:val="000000" w:themeColor="text1"/>
-          <w:sz w:val="20"/>
-          <w:szCs w:val="20"/>
-          <w:highlight w:val="white"/>
-        </w:rPr>
-        <w:t>}</w:t>
+        <w:t xml:space="preserve"> }}</w:t>
       </w:r>
     </w:p>
     <w:p>
@@ -666,29 +642,7 @@
                 <w:sz w:val="20"/>
                 <w:szCs w:val="20"/>
               </w:rPr>
-              <w:t>{{</w:t>
-            </w:r>
-            <w:proofErr w:type="gramStart"/>
-            <w:r>
-              <w:rPr>
-                <w:rFonts w:ascii="Arial" w:eastAsia="Arial" w:hAnsi="Arial" w:cs="Arial"/>
-                <w:b/>
-                <w:color w:val="000000" w:themeColor="text1"/>
-                <w:sz w:val="20"/>
-                <w:szCs w:val="20"/>
-              </w:rPr>
-              <w:t>divida</w:t>
-            </w:r>
-            <w:proofErr w:type="gramEnd"/>
-            <w:r>
-              <w:rPr>
-                <w:rFonts w:ascii="Arial" w:eastAsia="Arial" w:hAnsi="Arial" w:cs="Arial"/>
-                <w:b/>
-                <w:color w:val="000000" w:themeColor="text1"/>
-                <w:sz w:val="20"/>
-                <w:szCs w:val="20"/>
-              </w:rPr>
-              <w:t>}}</w:t>
+              <w:t>{{divida}}</w:t>
             </w:r>
           </w:p>
           <w:p>
@@ -3651,25 +3605,7 @@
           <w:sz w:val="20"/>
           <w:szCs w:val="20"/>
         </w:rPr>
-        <w:t xml:space="preserve">O atraso superior a 30 (trinta) dias de qualquer parcela deste contrato, acarretará </w:t>
-      </w:r>
-      <w:proofErr w:type="gramStart"/>
-      <w:r>
-        <w:rPr>
-          <w:rFonts w:ascii="Arial" w:eastAsia="Arial" w:hAnsi="Arial" w:cs="Arial"/>
-          <w:sz w:val="20"/>
-          <w:szCs w:val="20"/>
-        </w:rPr>
-        <w:t>na</w:t>
-      </w:r>
-      <w:proofErr w:type="gramEnd"/>
-      <w:r>
-        <w:rPr>
-          <w:rFonts w:ascii="Arial" w:eastAsia="Arial" w:hAnsi="Arial" w:cs="Arial"/>
-          <w:sz w:val="20"/>
-          <w:szCs w:val="20"/>
-        </w:rPr>
-        <w:t xml:space="preserve"> rescisão contratual, independente de notificação extrajudicial prévia, situação em que será aplicada multa por rescisão contratual no importe de 5% (cinco por cento) sobre o valor total DA DÍVIDA DO PRESENTE CONTRATO, item </w:t>
+        <w:t xml:space="preserve">O atraso superior a 30 (trinta) dias de qualquer parcela deste contrato, acarretará na rescisão contratual, independente de notificação extrajudicial prévia, situação em que será aplicada multa por rescisão contratual no importe de 5% (cinco por cento) sobre o valor total DA DÍVIDA DO PRESENTE CONTRATO, item </w:t>
       </w:r>
       <w:r>
         <w:rPr>
@@ -3802,7 +3738,6 @@
         <w:t>taxa_rescisao</w:t>
       </w:r>
       <w:proofErr w:type="spellEnd"/>
-      <w:proofErr w:type="gramStart"/>
       <w:r>
         <w:rPr>
           <w:rFonts w:ascii="Arial" w:eastAsia="Arial" w:hAnsi="Arial" w:cs="Arial"/>
@@ -3810,17 +3745,7 @@
           <w:sz w:val="20"/>
           <w:szCs w:val="20"/>
         </w:rPr>
-        <w:t>}}(</w:t>
-      </w:r>
-      <w:proofErr w:type="gramEnd"/>
-      <w:r>
-        <w:rPr>
-          <w:rFonts w:ascii="Arial" w:eastAsia="Arial" w:hAnsi="Arial" w:cs="Arial"/>
-          <w:color w:val="000000" w:themeColor="text1"/>
-          <w:sz w:val="20"/>
-          <w:szCs w:val="20"/>
-        </w:rPr>
-        <w:t>{{</w:t>
+        <w:t>}}({{</w:t>
       </w:r>
       <w:proofErr w:type="spellStart"/>
       <w:r>
@@ -4618,6 +4543,78 @@
         </w:rPr>
         <w:br/>
       </w:r>
+    </w:p>
+    <w:p>
+      <w:pPr>
+        <w:spacing w:after="0"/>
+        <w:ind w:firstLine="851"/>
+        <w:jc w:val="center"/>
+        <w:rPr>
+          <w:rFonts w:ascii="Tahoma" w:eastAsia="Tahoma" w:hAnsi="Tahoma" w:cs="Tahoma"/>
+          <w:sz w:val="22"/>
+          <w:szCs w:val="22"/>
+        </w:rPr>
+      </w:pPr>
+    </w:p>
+    <w:p>
+      <w:pPr>
+        <w:spacing w:after="0"/>
+        <w:ind w:firstLine="851"/>
+        <w:jc w:val="center"/>
+        <w:rPr>
+          <w:rFonts w:ascii="Tahoma" w:eastAsia="Tahoma" w:hAnsi="Tahoma" w:cs="Tahoma"/>
+          <w:sz w:val="22"/>
+          <w:szCs w:val="22"/>
+        </w:rPr>
+      </w:pPr>
+    </w:p>
+    <w:p>
+      <w:pPr>
+        <w:spacing w:after="0"/>
+        <w:ind w:firstLine="851"/>
+        <w:jc w:val="center"/>
+        <w:rPr>
+          <w:rFonts w:ascii="Tahoma" w:eastAsia="Tahoma" w:hAnsi="Tahoma" w:cs="Tahoma"/>
+          <w:sz w:val="22"/>
+          <w:szCs w:val="22"/>
+        </w:rPr>
+      </w:pPr>
+    </w:p>
+    <w:p>
+      <w:pPr>
+        <w:spacing w:after="0"/>
+        <w:ind w:firstLine="851"/>
+        <w:jc w:val="center"/>
+        <w:rPr>
+          <w:rFonts w:ascii="Tahoma" w:eastAsia="Tahoma" w:hAnsi="Tahoma" w:cs="Tahoma"/>
+          <w:sz w:val="22"/>
+          <w:szCs w:val="22"/>
+        </w:rPr>
+      </w:pPr>
+    </w:p>
+    <w:p>
+      <w:pPr>
+        <w:spacing w:after="0"/>
+        <w:ind w:firstLine="851"/>
+        <w:jc w:val="center"/>
+        <w:rPr>
+          <w:rFonts w:ascii="Tahoma" w:eastAsia="Tahoma" w:hAnsi="Tahoma" w:cs="Tahoma"/>
+          <w:sz w:val="22"/>
+          <w:szCs w:val="22"/>
+        </w:rPr>
+      </w:pPr>
+    </w:p>
+    <w:p>
+      <w:pPr>
+        <w:spacing w:after="0"/>
+        <w:ind w:firstLine="851"/>
+        <w:jc w:val="center"/>
+        <w:rPr>
+          <w:rFonts w:ascii="Tahoma" w:eastAsia="Tahoma" w:hAnsi="Tahoma" w:cs="Tahoma"/>
+          <w:sz w:val="22"/>
+          <w:szCs w:val="22"/>
+        </w:rPr>
+      </w:pPr>
     </w:p>
     <w:p>
       <w:pPr>

</xml_diff>

<commit_message>
fix: procuração extrajudicial com formatação unificada e sem página em branco
- Corrige margens: contrato e procuração agora usam a mesma formatação
  (antes cada um mantinha a própria margem, parecendo folhas coladas)
- Remove overflow de página em branco entre contrato e procuração,
  causado por espaçamento excessivo nos templates antes da assinatura
- Compacta a procuração extrajudicial para caber em 1 página
- Corrige alinhamento do parágrafo OUTORGANTE na versão PJ
- Adiciona templates procuracao_extrajudicial.docx e _pj.docx
- Remove funções de merge de PDF que ficaram sem uso após simplificação

Co-Authored-By: Claude Sonnet 4.6 <noreply@anthropic.com>
</commit_message>
<xml_diff>
--- a/templates/emprestimo.docx
+++ b/templates/emprestimo.docx
@@ -154,7 +154,19 @@
           <w:szCs w:val="20"/>
           <w:highlight w:val="white"/>
         </w:rPr>
-        <w:t>bloco_cliente</w:t>
+        <w:t>bloco_</w:t>
+      </w:r>
+      <w:proofErr w:type="gramStart"/>
+      <w:r>
+        <w:rPr>
+          <w:rFonts w:ascii="Arial" w:eastAsia="Arial" w:hAnsi="Arial" w:cs="Arial"/>
+          <w:bCs/>
+          <w:color w:val="000000" w:themeColor="text1"/>
+          <w:sz w:val="20"/>
+          <w:szCs w:val="20"/>
+          <w:highlight w:val="white"/>
+        </w:rPr>
+        <w:t>cliente</w:t>
       </w:r>
       <w:proofErr w:type="spellEnd"/>
       <w:r>
@@ -166,7 +178,19 @@
           <w:szCs w:val="20"/>
           <w:highlight w:val="white"/>
         </w:rPr>
-        <w:t xml:space="preserve"> }}</w:t>
+        <w:t xml:space="preserve"> }</w:t>
+      </w:r>
+      <w:proofErr w:type="gramEnd"/>
+      <w:r>
+        <w:rPr>
+          <w:rFonts w:ascii="Arial" w:eastAsia="Arial" w:hAnsi="Arial" w:cs="Arial"/>
+          <w:bCs/>
+          <w:color w:val="000000" w:themeColor="text1"/>
+          <w:sz w:val="20"/>
+          <w:szCs w:val="20"/>
+          <w:highlight w:val="white"/>
+        </w:rPr>
+        <w:t>}</w:t>
       </w:r>
     </w:p>
     <w:p>
@@ -582,7 +606,28 @@
             </w:tcBorders>
           </w:tcPr>
           <w:p>
+            <w:r>
+              <w:t>{% for p in processos %}</w:t>
+            </w:r>
+          </w:p>
+          <w:p>
             <w:pPr>
+              <w:keepNext/>
+              <w:keepLines/>
+            </w:pPr>
+            <w:r>
+              <w:rPr>
+                <w:rFonts w:ascii="Arial" w:hAnsi="Arial"/>
+                <w:b/>
+                <w:sz w:val="20"/>
+              </w:rPr>
+              <w:t>Processo/Divida {{ loop.index }}</w:t>
+            </w:r>
+          </w:p>
+          <w:p>
+            <w:pPr>
+              <w:keepNext/>
+              <w:keepLines/>
               <w:jc w:val="both"/>
               <w:rPr>
                 <w:rFonts w:ascii="Arial" w:eastAsia="Arial" w:hAnsi="Arial" w:cs="Arial"/>
@@ -594,27 +639,16 @@
             </w:pPr>
             <w:r>
               <w:rPr>
-                <w:rFonts w:ascii="Arial" w:eastAsia="Arial" w:hAnsi="Arial" w:cs="Arial"/>
-                <w:bCs/>
-                <w:color w:val="000000" w:themeColor="text1"/>
+                <w:rFonts w:ascii="Arial" w:hAnsi="Arial"/>
                 <w:sz w:val="20"/>
-                <w:szCs w:val="20"/>
               </w:rPr>
-              <w:t xml:space="preserve">1.1 Banco Financiado: </w:t>
-            </w:r>
-            <w:r>
-              <w:rPr>
-                <w:rFonts w:ascii="Arial" w:eastAsia="Arial" w:hAnsi="Arial" w:cs="Arial"/>
-                <w:b/>
-                <w:color w:val="000000" w:themeColor="text1"/>
-                <w:sz w:val="20"/>
-                <w:szCs w:val="20"/>
-              </w:rPr>
-              <w:t>{{banco}}</w:t>
+              <w:t>1.1 Banco Financiado: {{ p.banco }}</w:t>
             </w:r>
           </w:p>
           <w:p>
             <w:pPr>
+              <w:keepNext/>
+              <w:keepLines/>
               <w:jc w:val="both"/>
               <w:rPr>
                 <w:rFonts w:ascii="Arial" w:eastAsia="Arial" w:hAnsi="Arial" w:cs="Arial"/>
@@ -624,29 +658,20 @@
                 <w:szCs w:val="20"/>
               </w:rPr>
             </w:pPr>
+            <w:proofErr w:type="gramStart"/>
+            <w:proofErr w:type="gramEnd"/>
             <w:r>
               <w:rPr>
-                <w:rFonts w:ascii="Arial" w:eastAsia="Arial" w:hAnsi="Arial" w:cs="Arial"/>
-                <w:bCs/>
-                <w:color w:val="000000" w:themeColor="text1"/>
+                <w:rFonts w:ascii="Arial" w:hAnsi="Arial"/>
                 <w:sz w:val="20"/>
-                <w:szCs w:val="20"/>
               </w:rPr>
-              <w:t xml:space="preserve">1.2 Dívida Atual: </w:t>
-            </w:r>
-            <w:r>
-              <w:rPr>
-                <w:rFonts w:ascii="Arial" w:eastAsia="Arial" w:hAnsi="Arial" w:cs="Arial"/>
-                <w:b/>
-                <w:color w:val="000000" w:themeColor="text1"/>
-                <w:sz w:val="20"/>
-                <w:szCs w:val="20"/>
-              </w:rPr>
-              <w:t>{{divida}}</w:t>
+              <w:t>1.2 Dívida Atual: {{ p.divida }}</w:t>
             </w:r>
           </w:p>
           <w:p>
             <w:pPr>
+              <w:keepNext/>
+              <w:keepLines/>
               <w:jc w:val="both"/>
               <w:rPr>
                 <w:rFonts w:ascii="Arial" w:eastAsia="Arial" w:hAnsi="Arial" w:cs="Arial"/>
@@ -656,41 +681,20 @@
                 <w:szCs w:val="20"/>
               </w:rPr>
             </w:pPr>
-            <w:r>
-              <w:rPr>
-                <w:rFonts w:ascii="Arial" w:eastAsia="Arial" w:hAnsi="Arial" w:cs="Arial"/>
-                <w:bCs/>
-                <w:color w:val="000000" w:themeColor="text1"/>
-                <w:sz w:val="20"/>
-                <w:szCs w:val="20"/>
-              </w:rPr>
-              <w:t>1.3 Valor da Parcela: {{</w:t>
-            </w:r>
             <w:proofErr w:type="spellStart"/>
-            <w:r>
-              <w:rPr>
-                <w:rFonts w:ascii="Arial" w:eastAsia="Arial" w:hAnsi="Arial" w:cs="Arial"/>
-                <w:bCs/>
-                <w:color w:val="000000" w:themeColor="text1"/>
-                <w:sz w:val="20"/>
-                <w:szCs w:val="20"/>
-              </w:rPr>
-              <w:t>valor_parcela_banco</w:t>
-            </w:r>
             <w:proofErr w:type="spellEnd"/>
             <w:r>
               <w:rPr>
-                <w:rFonts w:ascii="Arial" w:eastAsia="Arial" w:hAnsi="Arial" w:cs="Arial"/>
-                <w:bCs/>
-                <w:color w:val="000000" w:themeColor="text1"/>
+                <w:rFonts w:ascii="Arial" w:hAnsi="Arial"/>
                 <w:sz w:val="20"/>
-                <w:szCs w:val="20"/>
               </w:rPr>
-              <w:t>}}</w:t>
+              <w:t>1.3 Valor da Parcela: {{ p.valor_parcela }}</w:t>
             </w:r>
           </w:p>
           <w:p>
             <w:pPr>
+              <w:keepNext/>
+              <w:keepLines/>
               <w:jc w:val="both"/>
               <w:rPr>
                 <w:rFonts w:ascii="Arial" w:eastAsia="Arial" w:hAnsi="Arial" w:cs="Arial"/>
@@ -700,41 +704,20 @@
                 <w:szCs w:val="20"/>
               </w:rPr>
             </w:pPr>
-            <w:r>
-              <w:rPr>
-                <w:rFonts w:ascii="Arial" w:eastAsia="Arial" w:hAnsi="Arial" w:cs="Arial"/>
-                <w:bCs/>
-                <w:color w:val="000000" w:themeColor="text1"/>
-                <w:sz w:val="20"/>
-                <w:szCs w:val="20"/>
-              </w:rPr>
-              <w:t>1.4 Parcelas Totais: {{</w:t>
-            </w:r>
             <w:proofErr w:type="spellStart"/>
-            <w:r>
-              <w:rPr>
-                <w:rFonts w:ascii="Arial" w:eastAsia="Arial" w:hAnsi="Arial" w:cs="Arial"/>
-                <w:bCs/>
-                <w:color w:val="000000" w:themeColor="text1"/>
-                <w:sz w:val="20"/>
-                <w:szCs w:val="20"/>
-              </w:rPr>
-              <w:t>parcelas_totais</w:t>
-            </w:r>
             <w:proofErr w:type="spellEnd"/>
             <w:r>
               <w:rPr>
-                <w:rFonts w:ascii="Arial" w:eastAsia="Arial" w:hAnsi="Arial" w:cs="Arial"/>
-                <w:bCs/>
-                <w:color w:val="000000" w:themeColor="text1"/>
+                <w:rFonts w:ascii="Arial" w:hAnsi="Arial"/>
                 <w:sz w:val="20"/>
-                <w:szCs w:val="20"/>
               </w:rPr>
-              <w:t>}}</w:t>
+              <w:t>1.4 Parcelas Totais: {{ p.parcelas_totais }}</w:t>
             </w:r>
           </w:p>
           <w:p>
             <w:pPr>
+              <w:keepNext/>
+              <w:keepLines/>
               <w:jc w:val="both"/>
               <w:rPr>
                 <w:rFonts w:ascii="Arial" w:eastAsia="Arial" w:hAnsi="Arial" w:cs="Arial"/>
@@ -744,41 +727,20 @@
                 <w:szCs w:val="20"/>
               </w:rPr>
             </w:pPr>
-            <w:r>
-              <w:rPr>
-                <w:rFonts w:ascii="Arial" w:eastAsia="Arial" w:hAnsi="Arial" w:cs="Arial"/>
-                <w:bCs/>
-                <w:color w:val="000000" w:themeColor="text1"/>
-                <w:sz w:val="20"/>
-                <w:szCs w:val="20"/>
-              </w:rPr>
-              <w:t>1.5 Parcelas Pagas: {{</w:t>
-            </w:r>
             <w:proofErr w:type="spellStart"/>
-            <w:r>
-              <w:rPr>
-                <w:rFonts w:ascii="Arial" w:eastAsia="Arial" w:hAnsi="Arial" w:cs="Arial"/>
-                <w:bCs/>
-                <w:color w:val="000000" w:themeColor="text1"/>
-                <w:sz w:val="20"/>
-                <w:szCs w:val="20"/>
-              </w:rPr>
-              <w:t>parcelas_pagas</w:t>
-            </w:r>
             <w:proofErr w:type="spellEnd"/>
             <w:r>
               <w:rPr>
-                <w:rFonts w:ascii="Arial" w:eastAsia="Arial" w:hAnsi="Arial" w:cs="Arial"/>
-                <w:bCs/>
-                <w:color w:val="000000" w:themeColor="text1"/>
+                <w:rFonts w:ascii="Arial" w:hAnsi="Arial"/>
                 <w:sz w:val="20"/>
-                <w:szCs w:val="20"/>
               </w:rPr>
-              <w:t>}}</w:t>
+              <w:t>1.5 Parcelas Pagas: {{ p.parcelas_pagas }}</w:t>
             </w:r>
           </w:p>
           <w:p>
             <w:pPr>
+              <w:keepNext/>
+              <w:keepLines/>
               <w:jc w:val="both"/>
               <w:rPr>
                 <w:rFonts w:ascii="Arial" w:eastAsia="Arial" w:hAnsi="Arial" w:cs="Arial"/>
@@ -788,41 +750,20 @@
                 <w:szCs w:val="20"/>
               </w:rPr>
             </w:pPr>
-            <w:r>
-              <w:rPr>
-                <w:rFonts w:ascii="Arial" w:eastAsia="Arial" w:hAnsi="Arial" w:cs="Arial"/>
-                <w:bCs/>
-                <w:color w:val="000000" w:themeColor="text1"/>
-                <w:sz w:val="20"/>
-                <w:szCs w:val="20"/>
-              </w:rPr>
-              <w:t>1.6 Parcelas Em Aberto: {{</w:t>
-            </w:r>
             <w:proofErr w:type="spellStart"/>
-            <w:r>
-              <w:rPr>
-                <w:rFonts w:ascii="Arial" w:eastAsia="Arial" w:hAnsi="Arial" w:cs="Arial"/>
-                <w:bCs/>
-                <w:color w:val="000000" w:themeColor="text1"/>
-                <w:sz w:val="20"/>
-                <w:szCs w:val="20"/>
-              </w:rPr>
-              <w:t>parcelas_abertas</w:t>
-            </w:r>
             <w:proofErr w:type="spellEnd"/>
             <w:r>
               <w:rPr>
-                <w:rFonts w:ascii="Arial" w:eastAsia="Arial" w:hAnsi="Arial" w:cs="Arial"/>
-                <w:bCs/>
-                <w:color w:val="000000" w:themeColor="text1"/>
+                <w:rFonts w:ascii="Arial" w:hAnsi="Arial"/>
                 <w:sz w:val="20"/>
-                <w:szCs w:val="20"/>
               </w:rPr>
-              <w:t>}}</w:t>
+              <w:t>1.6 Parcelas Em Aberto: {{ p.parcelas_abertas }}</w:t>
             </w:r>
           </w:p>
           <w:p>
             <w:pPr>
+              <w:keepNext/>
+              <w:keepLines/>
               <w:jc w:val="both"/>
               <w:rPr>
                 <w:rFonts w:ascii="Arial" w:eastAsia="Arial" w:hAnsi="Arial" w:cs="Arial"/>
@@ -832,41 +773,19 @@
                 <w:szCs w:val="20"/>
               </w:rPr>
             </w:pPr>
-            <w:r>
-              <w:rPr>
-                <w:rFonts w:ascii="Arial" w:eastAsia="Arial" w:hAnsi="Arial" w:cs="Arial"/>
-                <w:bCs/>
-                <w:color w:val="000000" w:themeColor="text1"/>
-                <w:sz w:val="20"/>
-                <w:szCs w:val="20"/>
-              </w:rPr>
-              <w:t>1.7 Parcelas Vencidas: {{</w:t>
-            </w:r>
             <w:proofErr w:type="spellStart"/>
-            <w:r>
-              <w:rPr>
-                <w:rFonts w:ascii="Arial" w:eastAsia="Arial" w:hAnsi="Arial" w:cs="Arial"/>
-                <w:bCs/>
-                <w:color w:val="000000" w:themeColor="text1"/>
-                <w:sz w:val="20"/>
-                <w:szCs w:val="20"/>
-              </w:rPr>
-              <w:t>parcelas_vencidas</w:t>
-            </w:r>
             <w:proofErr w:type="spellEnd"/>
             <w:r>
               <w:rPr>
-                <w:rFonts w:ascii="Arial" w:eastAsia="Arial" w:hAnsi="Arial" w:cs="Arial"/>
-                <w:bCs/>
-                <w:color w:val="000000" w:themeColor="text1"/>
+                <w:rFonts w:ascii="Arial" w:hAnsi="Arial"/>
                 <w:sz w:val="20"/>
-                <w:szCs w:val="20"/>
               </w:rPr>
-              <w:t>}}</w:t>
+              <w:t>1.7 Parcelas Vencidas: {{ p.parcelas_vencidas }}</w:t>
             </w:r>
           </w:p>
           <w:p>
             <w:pPr>
+              <w:keepLines/>
               <w:jc w:val="both"/>
               <w:rPr>
                 <w:rFonts w:ascii="Arial" w:eastAsia="Arial" w:hAnsi="Arial" w:cs="Arial"/>
@@ -876,47 +795,19 @@
                 <w:szCs w:val="20"/>
               </w:rPr>
             </w:pPr>
-            <w:r>
-              <w:rPr>
-                <w:rFonts w:ascii="Arial" w:eastAsia="Arial" w:hAnsi="Arial" w:cs="Arial"/>
-                <w:bCs/>
-                <w:color w:val="000000" w:themeColor="text1"/>
-                <w:sz w:val="20"/>
-                <w:szCs w:val="20"/>
-              </w:rPr>
-              <w:t xml:space="preserve">1.8 Existe processo? </w:t>
-            </w:r>
-            <w:r>
-              <w:rPr>
-                <w:rFonts w:ascii="Arial" w:eastAsia="Arial" w:hAnsi="Arial" w:cs="Arial"/>
-                <w:b/>
-                <w:color w:val="000000" w:themeColor="text1"/>
-                <w:sz w:val="20"/>
-                <w:szCs w:val="20"/>
-              </w:rPr>
-              <w:t>{{</w:t>
-            </w:r>
             <w:proofErr w:type="spellStart"/>
-            <w:r>
-              <w:rPr>
-                <w:rFonts w:ascii="Arial" w:eastAsia="Arial" w:hAnsi="Arial" w:cs="Arial"/>
-                <w:b/>
-                <w:color w:val="000000" w:themeColor="text1"/>
-                <w:sz w:val="20"/>
-                <w:szCs w:val="20"/>
-              </w:rPr>
-              <w:t>existe_processo</w:t>
-            </w:r>
             <w:proofErr w:type="spellEnd"/>
             <w:r>
               <w:rPr>
-                <w:rFonts w:ascii="Arial" w:eastAsia="Arial" w:hAnsi="Arial" w:cs="Arial"/>
-                <w:b/>
-                <w:color w:val="000000" w:themeColor="text1"/>
+                <w:rFonts w:ascii="Arial" w:hAnsi="Arial"/>
                 <w:sz w:val="20"/>
-                <w:szCs w:val="20"/>
               </w:rPr>
-              <w:t>}}</w:t>
+              <w:t>1.8 Existe processo? {{ p.existe_processo }}</w:t>
+            </w:r>
+          </w:p>
+          <w:p>
+            <w:r>
+              <w:t>{% endfor %}</w:t>
             </w:r>
           </w:p>
           <w:p>
@@ -3605,7 +3496,25 @@
           <w:sz w:val="20"/>
           <w:szCs w:val="20"/>
         </w:rPr>
-        <w:t xml:space="preserve">O atraso superior a 30 (trinta) dias de qualquer parcela deste contrato, acarretará na rescisão contratual, independente de notificação extrajudicial prévia, situação em que será aplicada multa por rescisão contratual no importe de 5% (cinco por cento) sobre o valor total DA DÍVIDA DO PRESENTE CONTRATO, item </w:t>
+        <w:t xml:space="preserve">O atraso superior a 30 (trinta) dias de qualquer parcela deste contrato, acarretará </w:t>
+      </w:r>
+      <w:proofErr w:type="gramStart"/>
+      <w:r>
+        <w:rPr>
+          <w:rFonts w:ascii="Arial" w:eastAsia="Arial" w:hAnsi="Arial" w:cs="Arial"/>
+          <w:sz w:val="20"/>
+          <w:szCs w:val="20"/>
+        </w:rPr>
+        <w:t>na</w:t>
+      </w:r>
+      <w:proofErr w:type="gramEnd"/>
+      <w:r>
+        <w:rPr>
+          <w:rFonts w:ascii="Arial" w:eastAsia="Arial" w:hAnsi="Arial" w:cs="Arial"/>
+          <w:sz w:val="20"/>
+          <w:szCs w:val="20"/>
+        </w:rPr>
+        <w:t xml:space="preserve"> rescisão contratual, independente de notificação extrajudicial prévia, situação em que será aplicada multa por rescisão contratual no importe de 5% (cinco por cento) sobre o valor total DA DÍVIDA DO PRESENTE CONTRATO, item </w:t>
       </w:r>
       <w:r>
         <w:rPr>
@@ -3738,6 +3647,7 @@
         <w:t>taxa_rescisao</w:t>
       </w:r>
       <w:proofErr w:type="spellEnd"/>
+      <w:proofErr w:type="gramStart"/>
       <w:r>
         <w:rPr>
           <w:rFonts w:ascii="Arial" w:eastAsia="Arial" w:hAnsi="Arial" w:cs="Arial"/>
@@ -3745,7 +3655,17 @@
           <w:sz w:val="20"/>
           <w:szCs w:val="20"/>
         </w:rPr>
-        <w:t>}}({{</w:t>
+        <w:t>}}(</w:t>
+      </w:r>
+      <w:proofErr w:type="gramEnd"/>
+      <w:r>
+        <w:rPr>
+          <w:rFonts w:ascii="Arial" w:eastAsia="Arial" w:hAnsi="Arial" w:cs="Arial"/>
+          <w:color w:val="000000" w:themeColor="text1"/>
+          <w:sz w:val="20"/>
+          <w:szCs w:val="20"/>
+        </w:rPr>
+        <w:t>{{</w:t>
       </w:r>
       <w:proofErr w:type="spellStart"/>
       <w:r>
@@ -4497,17 +4417,6 @@
           <w:szCs w:val="22"/>
         </w:rPr>
       </w:pPr>
-    </w:p>
-    <w:p>
-      <w:pPr>
-        <w:spacing w:after="0"/>
-        <w:jc w:val="center"/>
-        <w:rPr>
-          <w:rFonts w:ascii="Tahoma" w:eastAsia="Tahoma" w:hAnsi="Tahoma" w:cs="Tahoma"/>
-          <w:sz w:val="22"/>
-          <w:szCs w:val="22"/>
-        </w:rPr>
-      </w:pPr>
       <w:r>
         <w:rPr>
           <w:rFonts w:ascii="Tahoma" w:eastAsia="Tahoma" w:hAnsi="Tahoma" w:cs="Tahoma"/>
@@ -4543,78 +4452,6 @@
         </w:rPr>
         <w:br/>
       </w:r>
-    </w:p>
-    <w:p>
-      <w:pPr>
-        <w:spacing w:after="0"/>
-        <w:ind w:firstLine="851"/>
-        <w:jc w:val="center"/>
-        <w:rPr>
-          <w:rFonts w:ascii="Tahoma" w:eastAsia="Tahoma" w:hAnsi="Tahoma" w:cs="Tahoma"/>
-          <w:sz w:val="22"/>
-          <w:szCs w:val="22"/>
-        </w:rPr>
-      </w:pPr>
-    </w:p>
-    <w:p>
-      <w:pPr>
-        <w:spacing w:after="0"/>
-        <w:ind w:firstLine="851"/>
-        <w:jc w:val="center"/>
-        <w:rPr>
-          <w:rFonts w:ascii="Tahoma" w:eastAsia="Tahoma" w:hAnsi="Tahoma" w:cs="Tahoma"/>
-          <w:sz w:val="22"/>
-          <w:szCs w:val="22"/>
-        </w:rPr>
-      </w:pPr>
-    </w:p>
-    <w:p>
-      <w:pPr>
-        <w:spacing w:after="0"/>
-        <w:ind w:firstLine="851"/>
-        <w:jc w:val="center"/>
-        <w:rPr>
-          <w:rFonts w:ascii="Tahoma" w:eastAsia="Tahoma" w:hAnsi="Tahoma" w:cs="Tahoma"/>
-          <w:sz w:val="22"/>
-          <w:szCs w:val="22"/>
-        </w:rPr>
-      </w:pPr>
-    </w:p>
-    <w:p>
-      <w:pPr>
-        <w:spacing w:after="0"/>
-        <w:ind w:firstLine="851"/>
-        <w:jc w:val="center"/>
-        <w:rPr>
-          <w:rFonts w:ascii="Tahoma" w:eastAsia="Tahoma" w:hAnsi="Tahoma" w:cs="Tahoma"/>
-          <w:sz w:val="22"/>
-          <w:szCs w:val="22"/>
-        </w:rPr>
-      </w:pPr>
-    </w:p>
-    <w:p>
-      <w:pPr>
-        <w:spacing w:after="0"/>
-        <w:ind w:firstLine="851"/>
-        <w:jc w:val="center"/>
-        <w:rPr>
-          <w:rFonts w:ascii="Tahoma" w:eastAsia="Tahoma" w:hAnsi="Tahoma" w:cs="Tahoma"/>
-          <w:sz w:val="22"/>
-          <w:szCs w:val="22"/>
-        </w:rPr>
-      </w:pPr>
-    </w:p>
-    <w:p>
-      <w:pPr>
-        <w:spacing w:after="0"/>
-        <w:ind w:firstLine="851"/>
-        <w:jc w:val="center"/>
-        <w:rPr>
-          <w:rFonts w:ascii="Tahoma" w:eastAsia="Tahoma" w:hAnsi="Tahoma" w:cs="Tahoma"/>
-          <w:sz w:val="22"/>
-          <w:szCs w:val="22"/>
-        </w:rPr>
-      </w:pPr>
     </w:p>
     <w:p>
       <w:pPr>

</xml_diff>

<commit_message>
chore: edições manuais nos templates (espaçamento e separação procuração)
- Remove espaçamento excessivo antes da assinatura em emprestimo/veiculo/rural
- Separa procuração judicial (procuracao.docx/_pj.docx) da extrajudicial
- Adiciona templates procuracao_extrajudicial.docx e _pj.docx
</commit_message>
<xml_diff>
--- a/templates/emprestimo.docx
+++ b/templates/emprestimo.docx
@@ -154,7 +154,19 @@
           <w:szCs w:val="20"/>
           <w:highlight w:val="white"/>
         </w:rPr>
-        <w:t>bloco_cliente</w:t>
+        <w:t>bloco_</w:t>
+      </w:r>
+      <w:proofErr w:type="gramStart"/>
+      <w:r>
+        <w:rPr>
+          <w:rFonts w:ascii="Arial" w:eastAsia="Arial" w:hAnsi="Arial" w:cs="Arial"/>
+          <w:bCs/>
+          <w:color w:val="000000" w:themeColor="text1"/>
+          <w:sz w:val="20"/>
+          <w:szCs w:val="20"/>
+          <w:highlight w:val="white"/>
+        </w:rPr>
+        <w:t>cliente</w:t>
       </w:r>
       <w:proofErr w:type="spellEnd"/>
       <w:r>
@@ -166,7 +178,19 @@
           <w:szCs w:val="20"/>
           <w:highlight w:val="white"/>
         </w:rPr>
-        <w:t xml:space="preserve"> }}</w:t>
+        <w:t xml:space="preserve"> }</w:t>
+      </w:r>
+      <w:proofErr w:type="gramEnd"/>
+      <w:r>
+        <w:rPr>
+          <w:rFonts w:ascii="Arial" w:eastAsia="Arial" w:hAnsi="Arial" w:cs="Arial"/>
+          <w:bCs/>
+          <w:color w:val="000000" w:themeColor="text1"/>
+          <w:sz w:val="20"/>
+          <w:szCs w:val="20"/>
+          <w:highlight w:val="white"/>
+        </w:rPr>
+        <w:t>}</w:t>
       </w:r>
     </w:p>
     <w:p>
@@ -642,7 +666,29 @@
                 <w:sz w:val="20"/>
                 <w:szCs w:val="20"/>
               </w:rPr>
-              <w:t>{{divida}}</w:t>
+              <w:t>{{</w:t>
+            </w:r>
+            <w:proofErr w:type="gramStart"/>
+            <w:r>
+              <w:rPr>
+                <w:rFonts w:ascii="Arial" w:eastAsia="Arial" w:hAnsi="Arial" w:cs="Arial"/>
+                <w:b/>
+                <w:color w:val="000000" w:themeColor="text1"/>
+                <w:sz w:val="20"/>
+                <w:szCs w:val="20"/>
+              </w:rPr>
+              <w:t>divida</w:t>
+            </w:r>
+            <w:proofErr w:type="gramEnd"/>
+            <w:r>
+              <w:rPr>
+                <w:rFonts w:ascii="Arial" w:eastAsia="Arial" w:hAnsi="Arial" w:cs="Arial"/>
+                <w:b/>
+                <w:color w:val="000000" w:themeColor="text1"/>
+                <w:sz w:val="20"/>
+                <w:szCs w:val="20"/>
+              </w:rPr>
+              <w:t>}}</w:t>
             </w:r>
           </w:p>
           <w:p>
@@ -3605,7 +3651,25 @@
           <w:sz w:val="20"/>
           <w:szCs w:val="20"/>
         </w:rPr>
-        <w:t xml:space="preserve">O atraso superior a 30 (trinta) dias de qualquer parcela deste contrato, acarretará na rescisão contratual, independente de notificação extrajudicial prévia, situação em que será aplicada multa por rescisão contratual no importe de 5% (cinco por cento) sobre o valor total DA DÍVIDA DO PRESENTE CONTRATO, item </w:t>
+        <w:t xml:space="preserve">O atraso superior a 30 (trinta) dias de qualquer parcela deste contrato, acarretará </w:t>
+      </w:r>
+      <w:proofErr w:type="gramStart"/>
+      <w:r>
+        <w:rPr>
+          <w:rFonts w:ascii="Arial" w:eastAsia="Arial" w:hAnsi="Arial" w:cs="Arial"/>
+          <w:sz w:val="20"/>
+          <w:szCs w:val="20"/>
+        </w:rPr>
+        <w:t>na</w:t>
+      </w:r>
+      <w:proofErr w:type="gramEnd"/>
+      <w:r>
+        <w:rPr>
+          <w:rFonts w:ascii="Arial" w:eastAsia="Arial" w:hAnsi="Arial" w:cs="Arial"/>
+          <w:sz w:val="20"/>
+          <w:szCs w:val="20"/>
+        </w:rPr>
+        <w:t xml:space="preserve"> rescisão contratual, independente de notificação extrajudicial prévia, situação em que será aplicada multa por rescisão contratual no importe de 5% (cinco por cento) sobre o valor total DA DÍVIDA DO PRESENTE CONTRATO, item </w:t>
       </w:r>
       <w:r>
         <w:rPr>
@@ -3738,6 +3802,7 @@
         <w:t>taxa_rescisao</w:t>
       </w:r>
       <w:proofErr w:type="spellEnd"/>
+      <w:proofErr w:type="gramStart"/>
       <w:r>
         <w:rPr>
           <w:rFonts w:ascii="Arial" w:eastAsia="Arial" w:hAnsi="Arial" w:cs="Arial"/>
@@ -3745,7 +3810,17 @@
           <w:sz w:val="20"/>
           <w:szCs w:val="20"/>
         </w:rPr>
-        <w:t>}}({{</w:t>
+        <w:t>}}(</w:t>
+      </w:r>
+      <w:proofErr w:type="gramEnd"/>
+      <w:r>
+        <w:rPr>
+          <w:rFonts w:ascii="Arial" w:eastAsia="Arial" w:hAnsi="Arial" w:cs="Arial"/>
+          <w:color w:val="000000" w:themeColor="text1"/>
+          <w:sz w:val="20"/>
+          <w:szCs w:val="20"/>
+        </w:rPr>
+        <w:t>{{</w:t>
       </w:r>
       <w:proofErr w:type="spellStart"/>
       <w:r>
@@ -4497,17 +4572,6 @@
           <w:szCs w:val="22"/>
         </w:rPr>
       </w:pPr>
-    </w:p>
-    <w:p>
-      <w:pPr>
-        <w:spacing w:after="0"/>
-        <w:jc w:val="center"/>
-        <w:rPr>
-          <w:rFonts w:ascii="Tahoma" w:eastAsia="Tahoma" w:hAnsi="Tahoma" w:cs="Tahoma"/>
-          <w:sz w:val="22"/>
-          <w:szCs w:val="22"/>
-        </w:rPr>
-      </w:pPr>
       <w:r>
         <w:rPr>
           <w:rFonts w:ascii="Tahoma" w:eastAsia="Tahoma" w:hAnsi="Tahoma" w:cs="Tahoma"/>
@@ -4543,78 +4607,6 @@
         </w:rPr>
         <w:br/>
       </w:r>
-    </w:p>
-    <w:p>
-      <w:pPr>
-        <w:spacing w:after="0"/>
-        <w:ind w:firstLine="851"/>
-        <w:jc w:val="center"/>
-        <w:rPr>
-          <w:rFonts w:ascii="Tahoma" w:eastAsia="Tahoma" w:hAnsi="Tahoma" w:cs="Tahoma"/>
-          <w:sz w:val="22"/>
-          <w:szCs w:val="22"/>
-        </w:rPr>
-      </w:pPr>
-    </w:p>
-    <w:p>
-      <w:pPr>
-        <w:spacing w:after="0"/>
-        <w:ind w:firstLine="851"/>
-        <w:jc w:val="center"/>
-        <w:rPr>
-          <w:rFonts w:ascii="Tahoma" w:eastAsia="Tahoma" w:hAnsi="Tahoma" w:cs="Tahoma"/>
-          <w:sz w:val="22"/>
-          <w:szCs w:val="22"/>
-        </w:rPr>
-      </w:pPr>
-    </w:p>
-    <w:p>
-      <w:pPr>
-        <w:spacing w:after="0"/>
-        <w:ind w:firstLine="851"/>
-        <w:jc w:val="center"/>
-        <w:rPr>
-          <w:rFonts w:ascii="Tahoma" w:eastAsia="Tahoma" w:hAnsi="Tahoma" w:cs="Tahoma"/>
-          <w:sz w:val="22"/>
-          <w:szCs w:val="22"/>
-        </w:rPr>
-      </w:pPr>
-    </w:p>
-    <w:p>
-      <w:pPr>
-        <w:spacing w:after="0"/>
-        <w:ind w:firstLine="851"/>
-        <w:jc w:val="center"/>
-        <w:rPr>
-          <w:rFonts w:ascii="Tahoma" w:eastAsia="Tahoma" w:hAnsi="Tahoma" w:cs="Tahoma"/>
-          <w:sz w:val="22"/>
-          <w:szCs w:val="22"/>
-        </w:rPr>
-      </w:pPr>
-    </w:p>
-    <w:p>
-      <w:pPr>
-        <w:spacing w:after="0"/>
-        <w:ind w:firstLine="851"/>
-        <w:jc w:val="center"/>
-        <w:rPr>
-          <w:rFonts w:ascii="Tahoma" w:eastAsia="Tahoma" w:hAnsi="Tahoma" w:cs="Tahoma"/>
-          <w:sz w:val="22"/>
-          <w:szCs w:val="22"/>
-        </w:rPr>
-      </w:pPr>
-    </w:p>
-    <w:p>
-      <w:pPr>
-        <w:spacing w:after="0"/>
-        <w:ind w:firstLine="851"/>
-        <w:jc w:val="center"/>
-        <w:rPr>
-          <w:rFonts w:ascii="Tahoma" w:eastAsia="Tahoma" w:hAnsi="Tahoma" w:cs="Tahoma"/>
-          <w:sz w:val="22"/>
-          <w:szCs w:val="22"/>
-        </w:rPr>
-      </w:pPr>
     </w:p>
     <w:p>
       <w:pPr>

</xml_diff>